<commit_message>
Renomme la capture en Challenge_Exfiltration_ESD.pcap et le precise dans le Write Up
</commit_message>
<xml_diff>
--- a/WriteUp - Exfiltration sur l'intranet ESD.docx
+++ b/WriteUp - Exfiltration sur l'intranet ESD.docx
@@ -621,6 +621,47 @@
         </w:tc>
       </w:tr>
     </w:tbl>
+    <w:p/>
+    <w:p>
+      <w:pPr>
+        <w:pStyle w:val="Titre1"/>
+        <w:pBdr>
+          <w:bottom w:val="single" w:sz="8" w:space="6" w:color="9DC3E6"/>
+        </w:pBdr>
+        <w:spacing w:before="260" w:after="140"/>
+        <w:rPr>
+          <w:b/>
+          <w:bCs/>
+          <w:color w:val="2E5496"/>
+          <w:sz w:val="28"/>
+          <w:szCs w:val="28"/>
+        </w:rPr>
+      </w:pPr>
+      <w:r>
+        <w:rPr>
+          <w:b/>
+          <w:bCs/>
+          <w:color w:val="2E5496"/>
+          <w:sz w:val="28"/>
+          <w:szCs w:val="28"/>
+        </w:rPr>
+        <w:t>Mot de passe :</w:t>
+      </w:r>
+    </w:p>
+    <w:p/>
+    <w:p>
+      <w:r>
+        <w:t xml:space="preserve">Fichier ZIP </w:t>
+      </w:r>
+      <w:proofErr w:type="spellStart"/>
+      <w:r>
+        <w:t>Challenge_Exfiltration_ESD</w:t>
+      </w:r>
+      <w:proofErr w:type="spellEnd"/>
+      <w:r>
+        <w:t xml:space="preserve"> : nesd006. Fichier fourni : Challenge_Exfiltration_ESD.pcap</w:t>
+      </w:r>
+    </w:p>
     <w:p>
       <w:r>
         <w:br w:type="page"/>

</xml_diff>